<commit_message>
Moved on with the rest of the assignment... remain the last question.  check all please.
</commit_message>
<xml_diff>
--- a/script/dare1_table1.docx
+++ b/script/dare1_table1.docx
@@ -17,9 +17,9 @@
         <w:tblLook w:firstRow="1" w:lastRow="0" w:firstColumn="0" w:lastColumn="0" w:noHBand="0" w:noVBand="1"/>
       </w:tblPr>
       <w:tblGrid>
-        <w:gridCol w:w="4896"/>
-        <w:gridCol w:w="1296"/>
-        <w:gridCol w:w="1296"/>
+        <w:gridCol w:w="1080"/>
+        <w:gridCol w:w="1080"/>
+        <w:gridCol w:w="1080"/>
       </w:tblGrid>
       <w:tr>
         <w:trPr>
@@ -56,28 +56,28 @@
               <w:spacing w:after="100" w:before="100" w:line="240"/>
               <w:ind w:left="100" w:right="100" w:firstLine="0" w:firstLineChars="0"/>
               <w:rPr>
-                <w:rFonts w:ascii="Times New Roman" w:hAnsi="Times New Roman" w:eastAsia="Times New Roman" w:cs="Times New Roman"/>
-                <w:i w:val="false"/>
-                <w:b w:val="false"/>
-                <w:u w:val="none"/>
-                <w:strike w:val="false"/>
-                <w:sz w:val="22"/>
-                <w:szCs w:val="22"/>
-                <w:color w:val="000000"/>
-              </w:rPr>
-            </w:pPr>
-            <w:r>
-              <w:rPr>
-                <w:rFonts w:ascii="Times New Roman" w:hAnsi="Times New Roman" w:eastAsia="Times New Roman" w:cs="Times New Roman"/>
-                <w:i w:val="false"/>
-                <w:b w:val="false"/>
-                <w:u w:val="none"/>
-                <w:strike w:val="false"/>
-                <w:sz w:val="22"/>
-                <w:szCs w:val="22"/>
-                <w:color w:val="000000"/>
-              </w:rPr>
-              <w:t xml:space="preserve">Full Sample  (N = 470 state-year observations; 43 states; 2006–2017)</w:t>
+                <w:rFonts w:ascii="Helvetica" w:hAnsi="Helvetica" w:eastAsia="Helvetica" w:cs="Helvetica"/>
+                <w:i w:val="false"/>
+                <w:b w:val="false"/>
+                <w:u w:val="none"/>
+                <w:strike w:val="false"/>
+                <w:sz w:val="22"/>
+                <w:szCs w:val="22"/>
+                <w:color w:val="000000"/>
+              </w:rPr>
+            </w:pPr>
+            <w:r>
+              <w:rPr>
+                <w:rFonts w:ascii="Helvetica" w:hAnsi="Helvetica" w:eastAsia="Helvetica" w:cs="Helvetica"/>
+                <w:i w:val="false"/>
+                <w:b w:val="false"/>
+                <w:u w:val="none"/>
+                <w:strike w:val="false"/>
+                <w:sz w:val="22"/>
+                <w:szCs w:val="22"/>
+                <w:color w:val="000000"/>
+              </w:rPr>
+              <w:t xml:space="preserve">Full Sample (N = 470 state-year observations; 43 states; 2006–2017)</w:t>
             </w:r>
           </w:p>
         </w:tc>
@@ -111,19 +111,19 @@
               <w:spacing w:after="100" w:before="100" w:line="240"/>
               <w:ind w:left="100" w:right="100" w:firstLine="0" w:firstLineChars="0"/>
               <w:rPr>
-                <w:rFonts w:ascii="Times New Roman" w:hAnsi="Times New Roman" w:eastAsia="Times New Roman" w:cs="Times New Roman"/>
-                <w:i w:val="false"/>
-                <w:b w:val="false"/>
-                <w:u w:val="none"/>
-                <w:strike w:val="false"/>
-                <w:sz w:val="22"/>
-                <w:szCs w:val="22"/>
-                <w:color w:val="000000"/>
-              </w:rPr>
-            </w:pPr>
-            <w:r>
-              <w:rPr>
-                <w:rFonts w:ascii="Times New Roman" w:hAnsi="Times New Roman" w:eastAsia="Times New Roman" w:cs="Times New Roman"/>
+                <w:rFonts w:ascii="Helvetica" w:hAnsi="Helvetica" w:eastAsia="Helvetica" w:cs="Helvetica"/>
+                <w:i w:val="false"/>
+                <w:b w:val="false"/>
+                <w:u w:val="none"/>
+                <w:strike w:val="false"/>
+                <w:sz w:val="22"/>
+                <w:szCs w:val="22"/>
+                <w:color w:val="000000"/>
+              </w:rPr>
+            </w:pPr>
+            <w:r>
+              <w:rPr>
+                <w:rFonts w:ascii="Helvetica" w:hAnsi="Helvetica" w:eastAsia="Helvetica" w:cs="Helvetica"/>
                 <w:i w:val="false"/>
                 <w:b w:val="false"/>
                 <w:u w:val="none"/>
@@ -166,19 +166,19 @@
               <w:spacing w:after="100" w:before="100" w:line="240"/>
               <w:ind w:left="100" w:right="100" w:firstLine="0" w:firstLineChars="0"/>
               <w:rPr>
-                <w:rFonts w:ascii="Times New Roman" w:hAnsi="Times New Roman" w:eastAsia="Times New Roman" w:cs="Times New Roman"/>
-                <w:i w:val="false"/>
-                <w:b w:val="false"/>
-                <w:u w:val="none"/>
-                <w:strike w:val="false"/>
-                <w:sz w:val="22"/>
-                <w:szCs w:val="22"/>
-                <w:color w:val="000000"/>
-              </w:rPr>
-            </w:pPr>
-            <w:r>
-              <w:rPr>
-                <w:rFonts w:ascii="Times New Roman" w:hAnsi="Times New Roman" w:eastAsia="Times New Roman" w:cs="Times New Roman"/>
+                <w:rFonts w:ascii="Helvetica" w:hAnsi="Helvetica" w:eastAsia="Helvetica" w:cs="Helvetica"/>
+                <w:i w:val="false"/>
+                <w:b w:val="false"/>
+                <w:u w:val="none"/>
+                <w:strike w:val="false"/>
+                <w:sz w:val="22"/>
+                <w:szCs w:val="22"/>
+                <w:color w:val="000000"/>
+              </w:rPr>
+            </w:pPr>
+            <w:r>
+              <w:rPr>
+                <w:rFonts w:ascii="Helvetica" w:hAnsi="Helvetica" w:eastAsia="Helvetica" w:cs="Helvetica"/>
                 <w:i w:val="false"/>
                 <w:b w:val="false"/>
                 <w:u w:val="none"/>
@@ -227,19 +227,19 @@
               <w:spacing w:after="100" w:before="100" w:line="240"/>
               <w:ind w:left="100" w:right="100" w:firstLine="0" w:firstLineChars="0"/>
               <w:rPr>
-                <w:rFonts w:ascii="Times New Roman" w:hAnsi="Times New Roman" w:eastAsia="Times New Roman" w:cs="Times New Roman"/>
-                <w:i w:val="false"/>
-                <w:b w:val="false"/>
-                <w:u w:val="none"/>
-                <w:strike w:val="false"/>
-                <w:sz w:val="22"/>
-                <w:szCs w:val="22"/>
-                <w:color w:val="000000"/>
-              </w:rPr>
-            </w:pPr>
-            <w:r>
-              <w:rPr>
-                <w:rFonts w:ascii="Times New Roman" w:hAnsi="Times New Roman" w:eastAsia="Times New Roman" w:cs="Times New Roman"/>
+                <w:rFonts w:ascii="Helvetica" w:hAnsi="Helvetica" w:eastAsia="Helvetica" w:cs="Helvetica"/>
+                <w:i w:val="false"/>
+                <w:b w:val="false"/>
+                <w:u w:val="none"/>
+                <w:strike w:val="false"/>
+                <w:sz w:val="22"/>
+                <w:szCs w:val="22"/>
+                <w:color w:val="000000"/>
+              </w:rPr>
+            </w:pPr>
+            <w:r>
+              <w:rPr>
+                <w:rFonts w:ascii="Helvetica" w:hAnsi="Helvetica" w:eastAsia="Helvetica" w:cs="Helvetica"/>
                 <w:i w:val="false"/>
                 <w:b w:val="false"/>
                 <w:u w:val="none"/>
@@ -282,19 +282,19 @@
               <w:spacing w:after="100" w:before="100" w:line="240"/>
               <w:ind w:left="100" w:right="100" w:firstLine="0" w:firstLineChars="0"/>
               <w:rPr>
-                <w:rFonts w:ascii="Times New Roman" w:hAnsi="Times New Roman" w:eastAsia="Times New Roman" w:cs="Times New Roman"/>
-                <w:i w:val="false"/>
-                <w:b w:val="false"/>
-                <w:u w:val="none"/>
-                <w:strike w:val="false"/>
-                <w:sz w:val="22"/>
-                <w:szCs w:val="22"/>
-                <w:color w:val="000000"/>
-              </w:rPr>
-            </w:pPr>
-            <w:r>
-              <w:rPr>
-                <w:rFonts w:ascii="Times New Roman" w:hAnsi="Times New Roman" w:eastAsia="Times New Roman" w:cs="Times New Roman"/>
+                <w:rFonts w:ascii="Helvetica" w:hAnsi="Helvetica" w:eastAsia="Helvetica" w:cs="Helvetica"/>
+                <w:i w:val="false"/>
+                <w:b w:val="false"/>
+                <w:u w:val="none"/>
+                <w:strike w:val="false"/>
+                <w:sz w:val="22"/>
+                <w:szCs w:val="22"/>
+                <w:color w:val="000000"/>
+              </w:rPr>
+            </w:pPr>
+            <w:r>
+              <w:rPr>
+                <w:rFonts w:ascii="Helvetica" w:hAnsi="Helvetica" w:eastAsia="Helvetica" w:cs="Helvetica"/>
                 <w:i w:val="false"/>
                 <w:b w:val="false"/>
                 <w:u w:val="none"/>
@@ -337,19 +337,19 @@
               <w:spacing w:after="100" w:before="100" w:line="240"/>
               <w:ind w:left="100" w:right="100" w:firstLine="0" w:firstLineChars="0"/>
               <w:rPr>
-                <w:rFonts w:ascii="Times New Roman" w:hAnsi="Times New Roman" w:eastAsia="Times New Roman" w:cs="Times New Roman"/>
-                <w:i w:val="false"/>
-                <w:b w:val="false"/>
-                <w:u w:val="none"/>
-                <w:strike w:val="false"/>
-                <w:sz w:val="22"/>
-                <w:szCs w:val="22"/>
-                <w:color w:val="000000"/>
-              </w:rPr>
-            </w:pPr>
-            <w:r>
-              <w:rPr>
-                <w:rFonts w:ascii="Times New Roman" w:hAnsi="Times New Roman" w:eastAsia="Times New Roman" w:cs="Times New Roman"/>
+                <w:rFonts w:ascii="Helvetica" w:hAnsi="Helvetica" w:eastAsia="Helvetica" w:cs="Helvetica"/>
+                <w:i w:val="false"/>
+                <w:b w:val="false"/>
+                <w:u w:val="none"/>
+                <w:strike w:val="false"/>
+                <w:sz w:val="22"/>
+                <w:szCs w:val="22"/>
+                <w:color w:val="000000"/>
+              </w:rPr>
+            </w:pPr>
+            <w:r>
+              <w:rPr>
+                <w:rFonts w:ascii="Helvetica" w:hAnsi="Helvetica" w:eastAsia="Helvetica" w:cs="Helvetica"/>
                 <w:i w:val="false"/>
                 <w:b w:val="false"/>
                 <w:u w:val="none"/>
@@ -397,7 +397,7 @@
               <w:spacing w:after="100" w:before="100" w:line="240"/>
               <w:ind w:left="100" w:right="100" w:firstLine="0" w:firstLineChars="0"/>
               <w:rPr>
-                <w:rFonts w:ascii="Times New Roman" w:hAnsi="Times New Roman" w:eastAsia="Times New Roman" w:cs="Times New Roman"/>
+                <w:rFonts w:ascii="Helvetica" w:hAnsi="Helvetica" w:eastAsia="Helvetica" w:cs="Helvetica"/>
                 <w:i w:val="false"/>
                 <w:b w:val="true"/>
                 <w:u w:val="none"/>
@@ -409,7 +409,7 @@
             </w:pPr>
             <w:r>
               <w:rPr>
-                <w:rFonts w:ascii="Times New Roman" w:hAnsi="Times New Roman" w:eastAsia="Times New Roman" w:cs="Times New Roman"/>
+                <w:rFonts w:ascii="Helvetica" w:hAnsi="Helvetica" w:eastAsia="Helvetica" w:cs="Helvetica"/>
                 <w:i w:val="false"/>
                 <w:b w:val="true"/>
                 <w:u w:val="none"/>
@@ -452,7 +452,7 @@
               <w:spacing w:after="100" w:before="100" w:line="240"/>
               <w:ind w:left="100" w:right="100" w:firstLine="0" w:firstLineChars="0"/>
               <w:rPr>
-                <w:rFonts w:ascii="Times New Roman" w:hAnsi="Times New Roman" w:eastAsia="Times New Roman" w:cs="Times New Roman"/>
+                <w:rFonts w:ascii="Helvetica" w:hAnsi="Helvetica" w:eastAsia="Helvetica" w:cs="Helvetica"/>
                 <w:i w:val="false"/>
                 <w:b w:val="true"/>
                 <w:u w:val="none"/>
@@ -464,7 +464,7 @@
             </w:pPr>
             <w:r>
               <w:rPr>
-                <w:rFonts w:ascii="Times New Roman" w:hAnsi="Times New Roman" w:eastAsia="Times New Roman" w:cs="Times New Roman"/>
+                <w:rFonts w:ascii="Helvetica" w:hAnsi="Helvetica" w:eastAsia="Helvetica" w:cs="Helvetica"/>
                 <w:i w:val="false"/>
                 <w:b w:val="true"/>
                 <w:u w:val="none"/>
@@ -507,7 +507,7 @@
               <w:spacing w:after="100" w:before="100" w:line="240"/>
               <w:ind w:left="100" w:right="100" w:firstLine="0" w:firstLineChars="0"/>
               <w:rPr>
-                <w:rFonts w:ascii="Times New Roman" w:hAnsi="Times New Roman" w:eastAsia="Times New Roman" w:cs="Times New Roman"/>
+                <w:rFonts w:ascii="Helvetica" w:hAnsi="Helvetica" w:eastAsia="Helvetica" w:cs="Helvetica"/>
                 <w:i w:val="false"/>
                 <w:b w:val="true"/>
                 <w:u w:val="none"/>
@@ -519,7 +519,7 @@
             </w:pPr>
             <w:r>
               <w:rPr>
-                <w:rFonts w:ascii="Times New Roman" w:hAnsi="Times New Roman" w:eastAsia="Times New Roman" w:cs="Times New Roman"/>
+                <w:rFonts w:ascii="Helvetica" w:hAnsi="Helvetica" w:eastAsia="Helvetica" w:cs="Helvetica"/>
                 <w:i w:val="false"/>
                 <w:b w:val="true"/>
                 <w:u w:val="none"/>
@@ -567,28 +567,28 @@
               <w:spacing w:after="100" w:before="100" w:line="240"/>
               <w:ind w:left="100" w:right="100" w:firstLine="0" w:firstLineChars="0"/>
               <w:rPr>
-                <w:rFonts w:ascii="Times New Roman" w:hAnsi="Times New Roman" w:eastAsia="Times New Roman" w:cs="Times New Roman"/>
-                <w:i w:val="false"/>
-                <w:b w:val="false"/>
-                <w:u w:val="none"/>
-                <w:strike w:val="false"/>
-                <w:sz w:val="22"/>
-                <w:szCs w:val="22"/>
-                <w:color w:val="000000"/>
-              </w:rPr>
-            </w:pPr>
-            <w:r>
-              <w:rPr>
-                <w:rFonts w:ascii="Times New Roman" w:hAnsi="Times New Roman" w:eastAsia="Times New Roman" w:cs="Times New Roman"/>
-                <w:i w:val="false"/>
-                <w:b w:val="false"/>
-                <w:u w:val="none"/>
-                <w:strike w:val="false"/>
-                <w:sz w:val="22"/>
-                <w:szCs w:val="22"/>
-                <w:color w:val="000000"/>
-              </w:rPr>
-              <w:t xml:space="preserve">  Mean state-year enrollment</w:t>
+                <w:rFonts w:ascii="Helvetica" w:hAnsi="Helvetica" w:eastAsia="Helvetica" w:cs="Helvetica"/>
+                <w:i w:val="false"/>
+                <w:b w:val="false"/>
+                <w:u w:val="none"/>
+                <w:strike w:val="false"/>
+                <w:sz w:val="22"/>
+                <w:szCs w:val="22"/>
+                <w:color w:val="000000"/>
+              </w:rPr>
+            </w:pPr>
+            <w:r>
+              <w:rPr>
+                <w:rFonts w:ascii="Helvetica" w:hAnsi="Helvetica" w:eastAsia="Helvetica" w:cs="Helvetica"/>
+                <w:i w:val="false"/>
+                <w:b w:val="false"/>
+                <w:u w:val="none"/>
+                <w:strike w:val="false"/>
+                <w:sz w:val="22"/>
+                <w:szCs w:val="22"/>
+                <w:color w:val="000000"/>
+              </w:rPr>
+              <w:t xml:space="preserve">  Mean state-level enrollment</w:t>
             </w:r>
           </w:p>
         </w:tc>
@@ -622,19 +622,19 @@
               <w:spacing w:after="100" w:before="100" w:line="240"/>
               <w:ind w:left="100" w:right="100" w:firstLine="0" w:firstLineChars="0"/>
               <w:rPr>
-                <w:rFonts w:ascii="Times New Roman" w:hAnsi="Times New Roman" w:eastAsia="Times New Roman" w:cs="Times New Roman"/>
-                <w:i w:val="false"/>
-                <w:b w:val="false"/>
-                <w:u w:val="none"/>
-                <w:strike w:val="false"/>
-                <w:sz w:val="22"/>
-                <w:szCs w:val="22"/>
-                <w:color w:val="000000"/>
-              </w:rPr>
-            </w:pPr>
-            <w:r>
-              <w:rPr>
-                <w:rFonts w:ascii="Times New Roman" w:hAnsi="Times New Roman" w:eastAsia="Times New Roman" w:cs="Times New Roman"/>
+                <w:rFonts w:ascii="Helvetica" w:hAnsi="Helvetica" w:eastAsia="Helvetica" w:cs="Helvetica"/>
+                <w:i w:val="false"/>
+                <w:b w:val="false"/>
+                <w:u w:val="none"/>
+                <w:strike w:val="false"/>
+                <w:sz w:val="22"/>
+                <w:szCs w:val="22"/>
+                <w:color w:val="000000"/>
+              </w:rPr>
+            </w:pPr>
+            <w:r>
+              <w:rPr>
+                <w:rFonts w:ascii="Helvetica" w:hAnsi="Helvetica" w:eastAsia="Helvetica" w:cs="Helvetica"/>
                 <w:i w:val="false"/>
                 <w:b w:val="false"/>
                 <w:u w:val="none"/>
@@ -677,19 +677,19 @@
               <w:spacing w:after="100" w:before="100" w:line="240"/>
               <w:ind w:left="100" w:right="100" w:firstLine="0" w:firstLineChars="0"/>
               <w:rPr>
-                <w:rFonts w:ascii="Times New Roman" w:hAnsi="Times New Roman" w:eastAsia="Times New Roman" w:cs="Times New Roman"/>
-                <w:i w:val="false"/>
-                <w:b w:val="false"/>
-                <w:u w:val="none"/>
-                <w:strike w:val="false"/>
-                <w:sz w:val="22"/>
-                <w:szCs w:val="22"/>
-                <w:color w:val="000000"/>
-              </w:rPr>
-            </w:pPr>
-            <w:r>
-              <w:rPr>
-                <w:rFonts w:ascii="Times New Roman" w:hAnsi="Times New Roman" w:eastAsia="Times New Roman" w:cs="Times New Roman"/>
+                <w:rFonts w:ascii="Helvetica" w:hAnsi="Helvetica" w:eastAsia="Helvetica" w:cs="Helvetica"/>
+                <w:i w:val="false"/>
+                <w:b w:val="false"/>
+                <w:u w:val="none"/>
+                <w:strike w:val="false"/>
+                <w:sz w:val="22"/>
+                <w:szCs w:val="22"/>
+                <w:color w:val="000000"/>
+              </w:rPr>
+            </w:pPr>
+            <w:r>
+              <w:rPr>
+                <w:rFonts w:ascii="Helvetica" w:hAnsi="Helvetica" w:eastAsia="Helvetica" w:cs="Helvetica"/>
                 <w:i w:val="false"/>
                 <w:b w:val="false"/>
                 <w:u w:val="none"/>
@@ -737,28 +737,28 @@
               <w:spacing w:after="100" w:before="100" w:line="240"/>
               <w:ind w:left="100" w:right="100" w:firstLine="0" w:firstLineChars="0"/>
               <w:rPr>
-                <w:rFonts w:ascii="Times New Roman" w:hAnsi="Times New Roman" w:eastAsia="Times New Roman" w:cs="Times New Roman"/>
-                <w:i w:val="false"/>
-                <w:b w:val="false"/>
-                <w:u w:val="none"/>
-                <w:strike w:val="false"/>
-                <w:sz w:val="22"/>
-                <w:szCs w:val="22"/>
-                <w:color w:val="000000"/>
-              </w:rPr>
-            </w:pPr>
-            <w:r>
-              <w:rPr>
-                <w:rFonts w:ascii="Times New Roman" w:hAnsi="Times New Roman" w:eastAsia="Times New Roman" w:cs="Times New Roman"/>
-                <w:i w:val="false"/>
-                <w:b w:val="false"/>
-                <w:u w:val="none"/>
-                <w:strike w:val="false"/>
-                <w:sz w:val="22"/>
-                <w:szCs w:val="22"/>
-                <w:color w:val="000000"/>
-              </w:rPr>
-              <w:t xml:space="preserve">  Mean year enrollment</w:t>
+                <w:rFonts w:ascii="Helvetica" w:hAnsi="Helvetica" w:eastAsia="Helvetica" w:cs="Helvetica"/>
+                <w:i w:val="false"/>
+                <w:b w:val="false"/>
+                <w:u w:val="none"/>
+                <w:strike w:val="false"/>
+                <w:sz w:val="22"/>
+                <w:szCs w:val="22"/>
+                <w:color w:val="000000"/>
+              </w:rPr>
+            </w:pPr>
+            <w:r>
+              <w:rPr>
+                <w:rFonts w:ascii="Helvetica" w:hAnsi="Helvetica" w:eastAsia="Helvetica" w:cs="Helvetica"/>
+                <w:i w:val="false"/>
+                <w:b w:val="false"/>
+                <w:u w:val="none"/>
+                <w:strike w:val="false"/>
+                <w:sz w:val="22"/>
+                <w:szCs w:val="22"/>
+                <w:color w:val="000000"/>
+              </w:rPr>
+              <w:t xml:space="preserve">  Mean state-year enrollment</w:t>
             </w:r>
           </w:p>
         </w:tc>
@@ -792,19 +792,19 @@
               <w:spacing w:after="100" w:before="100" w:line="240"/>
               <w:ind w:left="100" w:right="100" w:firstLine="0" w:firstLineChars="0"/>
               <w:rPr>
-                <w:rFonts w:ascii="Times New Roman" w:hAnsi="Times New Roman" w:eastAsia="Times New Roman" w:cs="Times New Roman"/>
-                <w:i w:val="false"/>
-                <w:b w:val="false"/>
-                <w:u w:val="none"/>
-                <w:strike w:val="false"/>
-                <w:sz w:val="22"/>
-                <w:szCs w:val="22"/>
-                <w:color w:val="000000"/>
-              </w:rPr>
-            </w:pPr>
-            <w:r>
-              <w:rPr>
-                <w:rFonts w:ascii="Times New Roman" w:hAnsi="Times New Roman" w:eastAsia="Times New Roman" w:cs="Times New Roman"/>
+                <w:rFonts w:ascii="Helvetica" w:hAnsi="Helvetica" w:eastAsia="Helvetica" w:cs="Helvetica"/>
+                <w:i w:val="false"/>
+                <w:b w:val="false"/>
+                <w:u w:val="none"/>
+                <w:strike w:val="false"/>
+                <w:sz w:val="22"/>
+                <w:szCs w:val="22"/>
+                <w:color w:val="000000"/>
+              </w:rPr>
+            </w:pPr>
+            <w:r>
+              <w:rPr>
+                <w:rFonts w:ascii="Helvetica" w:hAnsi="Helvetica" w:eastAsia="Helvetica" w:cs="Helvetica"/>
                 <w:i w:val="false"/>
                 <w:b w:val="false"/>
                 <w:u w:val="none"/>
@@ -847,19 +847,19 @@
               <w:spacing w:after="100" w:before="100" w:line="240"/>
               <w:ind w:left="100" w:right="100" w:firstLine="0" w:firstLineChars="0"/>
               <w:rPr>
-                <w:rFonts w:ascii="Times New Roman" w:hAnsi="Times New Roman" w:eastAsia="Times New Roman" w:cs="Times New Roman"/>
-                <w:i w:val="false"/>
-                <w:b w:val="false"/>
-                <w:u w:val="none"/>
-                <w:strike w:val="false"/>
-                <w:sz w:val="22"/>
-                <w:szCs w:val="22"/>
-                <w:color w:val="000000"/>
-              </w:rPr>
-            </w:pPr>
-            <w:r>
-              <w:rPr>
-                <w:rFonts w:ascii="Times New Roman" w:hAnsi="Times New Roman" w:eastAsia="Times New Roman" w:cs="Times New Roman"/>
+                <w:rFonts w:ascii="Helvetica" w:hAnsi="Helvetica" w:eastAsia="Helvetica" w:cs="Helvetica"/>
+                <w:i w:val="false"/>
+                <w:b w:val="false"/>
+                <w:u w:val="none"/>
+                <w:strike w:val="false"/>
+                <w:sz w:val="22"/>
+                <w:szCs w:val="22"/>
+                <w:color w:val="000000"/>
+              </w:rPr>
+            </w:pPr>
+            <w:r>
+              <w:rPr>
+                <w:rFonts w:ascii="Helvetica" w:hAnsi="Helvetica" w:eastAsia="Helvetica" w:cs="Helvetica"/>
                 <w:i w:val="false"/>
                 <w:b w:val="false"/>
                 <w:u w:val="none"/>
@@ -907,7 +907,7 @@
               <w:spacing w:after="100" w:before="100" w:line="240"/>
               <w:ind w:left="100" w:right="100" w:firstLine="0" w:firstLineChars="0"/>
               <w:rPr>
-                <w:rFonts w:ascii="Times New Roman" w:hAnsi="Times New Roman" w:eastAsia="Times New Roman" w:cs="Times New Roman"/>
+                <w:rFonts w:ascii="Helvetica" w:hAnsi="Helvetica" w:eastAsia="Helvetica" w:cs="Helvetica"/>
                 <w:i w:val="false"/>
                 <w:b w:val="true"/>
                 <w:u w:val="none"/>
@@ -919,7 +919,7 @@
             </w:pPr>
             <w:r>
               <w:rPr>
-                <w:rFonts w:ascii="Times New Roman" w:hAnsi="Times New Roman" w:eastAsia="Times New Roman" w:cs="Times New Roman"/>
+                <w:rFonts w:ascii="Helvetica" w:hAnsi="Helvetica" w:eastAsia="Helvetica" w:cs="Helvetica"/>
                 <w:i w:val="false"/>
                 <w:b w:val="true"/>
                 <w:u w:val="none"/>
@@ -962,7 +962,7 @@
               <w:spacing w:after="100" w:before="100" w:line="240"/>
               <w:ind w:left="100" w:right="100" w:firstLine="0" w:firstLineChars="0"/>
               <w:rPr>
-                <w:rFonts w:ascii="Times New Roman" w:hAnsi="Times New Roman" w:eastAsia="Times New Roman" w:cs="Times New Roman"/>
+                <w:rFonts w:ascii="Helvetica" w:hAnsi="Helvetica" w:eastAsia="Helvetica" w:cs="Helvetica"/>
                 <w:i w:val="false"/>
                 <w:b w:val="true"/>
                 <w:u w:val="none"/>
@@ -974,7 +974,7 @@
             </w:pPr>
             <w:r>
               <w:rPr>
-                <w:rFonts w:ascii="Times New Roman" w:hAnsi="Times New Roman" w:eastAsia="Times New Roman" w:cs="Times New Roman"/>
+                <w:rFonts w:ascii="Helvetica" w:hAnsi="Helvetica" w:eastAsia="Helvetica" w:cs="Helvetica"/>
                 <w:i w:val="false"/>
                 <w:b w:val="true"/>
                 <w:u w:val="none"/>
@@ -1017,7 +1017,7 @@
               <w:spacing w:after="100" w:before="100" w:line="240"/>
               <w:ind w:left="100" w:right="100" w:firstLine="0" w:firstLineChars="0"/>
               <w:rPr>
-                <w:rFonts w:ascii="Times New Roman" w:hAnsi="Times New Roman" w:eastAsia="Times New Roman" w:cs="Times New Roman"/>
+                <w:rFonts w:ascii="Helvetica" w:hAnsi="Helvetica" w:eastAsia="Helvetica" w:cs="Helvetica"/>
                 <w:i w:val="false"/>
                 <w:b w:val="true"/>
                 <w:u w:val="none"/>
@@ -1029,7 +1029,7 @@
             </w:pPr>
             <w:r>
               <w:rPr>
-                <w:rFonts w:ascii="Times New Roman" w:hAnsi="Times New Roman" w:eastAsia="Times New Roman" w:cs="Times New Roman"/>
+                <w:rFonts w:ascii="Helvetica" w:hAnsi="Helvetica" w:eastAsia="Helvetica" w:cs="Helvetica"/>
                 <w:i w:val="false"/>
                 <w:b w:val="true"/>
                 <w:u w:val="none"/>
@@ -1077,19 +1077,19 @@
               <w:spacing w:after="100" w:before="100" w:line="240"/>
               <w:ind w:left="100" w:right="100" w:firstLine="0" w:firstLineChars="0"/>
               <w:rPr>
-                <w:rFonts w:ascii="Times New Roman" w:hAnsi="Times New Roman" w:eastAsia="Times New Roman" w:cs="Times New Roman"/>
-                <w:i w:val="false"/>
-                <w:b w:val="false"/>
-                <w:u w:val="none"/>
-                <w:strike w:val="false"/>
-                <w:sz w:val="22"/>
-                <w:szCs w:val="22"/>
-                <w:color w:val="000000"/>
-              </w:rPr>
-            </w:pPr>
-            <w:r>
-              <w:rPr>
-                <w:rFonts w:ascii="Times New Roman" w:hAnsi="Times New Roman" w:eastAsia="Times New Roman" w:cs="Times New Roman"/>
+                <w:rFonts w:ascii="Helvetica" w:hAnsi="Helvetica" w:eastAsia="Helvetica" w:cs="Helvetica"/>
+                <w:i w:val="false"/>
+                <w:b w:val="false"/>
+                <w:u w:val="none"/>
+                <w:strike w:val="false"/>
+                <w:sz w:val="22"/>
+                <w:szCs w:val="22"/>
+                <w:color w:val="000000"/>
+              </w:rPr>
+            </w:pPr>
+            <w:r>
+              <w:rPr>
+                <w:rFonts w:ascii="Helvetica" w:hAnsi="Helvetica" w:eastAsia="Helvetica" w:cs="Helvetica"/>
                 <w:i w:val="false"/>
                 <w:b w:val="false"/>
                 <w:u w:val="none"/>
@@ -1132,19 +1132,19 @@
               <w:spacing w:after="100" w:before="100" w:line="240"/>
               <w:ind w:left="100" w:right="100" w:firstLine="0" w:firstLineChars="0"/>
               <w:rPr>
-                <w:rFonts w:ascii="Times New Roman" w:hAnsi="Times New Roman" w:eastAsia="Times New Roman" w:cs="Times New Roman"/>
-                <w:i w:val="false"/>
-                <w:b w:val="false"/>
-                <w:u w:val="none"/>
-                <w:strike w:val="false"/>
-                <w:sz w:val="22"/>
-                <w:szCs w:val="22"/>
-                <w:color w:val="000000"/>
-              </w:rPr>
-            </w:pPr>
-            <w:r>
-              <w:rPr>
-                <w:rFonts w:ascii="Times New Roman" w:hAnsi="Times New Roman" w:eastAsia="Times New Roman" w:cs="Times New Roman"/>
+                <w:rFonts w:ascii="Helvetica" w:hAnsi="Helvetica" w:eastAsia="Helvetica" w:cs="Helvetica"/>
+                <w:i w:val="false"/>
+                <w:b w:val="false"/>
+                <w:u w:val="none"/>
+                <w:strike w:val="false"/>
+                <w:sz w:val="22"/>
+                <w:szCs w:val="22"/>
+                <w:color w:val="000000"/>
+              </w:rPr>
+            </w:pPr>
+            <w:r>
+              <w:rPr>
+                <w:rFonts w:ascii="Helvetica" w:hAnsi="Helvetica" w:eastAsia="Helvetica" w:cs="Helvetica"/>
                 <w:i w:val="false"/>
                 <w:b w:val="false"/>
                 <w:u w:val="none"/>
@@ -1187,19 +1187,19 @@
               <w:spacing w:after="100" w:before="100" w:line="240"/>
               <w:ind w:left="100" w:right="100" w:firstLine="0" w:firstLineChars="0"/>
               <w:rPr>
-                <w:rFonts w:ascii="Times New Roman" w:hAnsi="Times New Roman" w:eastAsia="Times New Roman" w:cs="Times New Roman"/>
-                <w:i w:val="false"/>
-                <w:b w:val="false"/>
-                <w:u w:val="none"/>
-                <w:strike w:val="false"/>
-                <w:sz w:val="22"/>
-                <w:szCs w:val="22"/>
-                <w:color w:val="000000"/>
-              </w:rPr>
-            </w:pPr>
-            <w:r>
-              <w:rPr>
-                <w:rFonts w:ascii="Times New Roman" w:hAnsi="Times New Roman" w:eastAsia="Times New Roman" w:cs="Times New Roman"/>
+                <w:rFonts w:ascii="Helvetica" w:hAnsi="Helvetica" w:eastAsia="Helvetica" w:cs="Helvetica"/>
+                <w:i w:val="false"/>
+                <w:b w:val="false"/>
+                <w:u w:val="none"/>
+                <w:strike w:val="false"/>
+                <w:sz w:val="22"/>
+                <w:szCs w:val="22"/>
+                <w:color w:val="000000"/>
+              </w:rPr>
+            </w:pPr>
+            <w:r>
+              <w:rPr>
+                <w:rFonts w:ascii="Helvetica" w:hAnsi="Helvetica" w:eastAsia="Helvetica" w:cs="Helvetica"/>
                 <w:i w:val="false"/>
                 <w:b w:val="false"/>
                 <w:u w:val="none"/>
@@ -1247,19 +1247,19 @@
               <w:spacing w:after="100" w:before="100" w:line="240"/>
               <w:ind w:left="100" w:right="100" w:firstLine="0" w:firstLineChars="0"/>
               <w:rPr>
-                <w:rFonts w:ascii="Times New Roman" w:hAnsi="Times New Roman" w:eastAsia="Times New Roman" w:cs="Times New Roman"/>
-                <w:i w:val="false"/>
-                <w:b w:val="false"/>
-                <w:u w:val="none"/>
-                <w:strike w:val="false"/>
-                <w:sz w:val="22"/>
-                <w:szCs w:val="22"/>
-                <w:color w:val="000000"/>
-              </w:rPr>
-            </w:pPr>
-            <w:r>
-              <w:rPr>
-                <w:rFonts w:ascii="Times New Roman" w:hAnsi="Times New Roman" w:eastAsia="Times New Roman" w:cs="Times New Roman"/>
+                <w:rFonts w:ascii="Helvetica" w:hAnsi="Helvetica" w:eastAsia="Helvetica" w:cs="Helvetica"/>
+                <w:i w:val="false"/>
+                <w:b w:val="false"/>
+                <w:u w:val="none"/>
+                <w:strike w:val="false"/>
+                <w:sz w:val="22"/>
+                <w:szCs w:val="22"/>
+                <w:color w:val="000000"/>
+              </w:rPr>
+            </w:pPr>
+            <w:r>
+              <w:rPr>
+                <w:rFonts w:ascii="Helvetica" w:hAnsi="Helvetica" w:eastAsia="Helvetica" w:cs="Helvetica"/>
                 <w:i w:val="false"/>
                 <w:b w:val="false"/>
                 <w:u w:val="none"/>
@@ -1302,19 +1302,19 @@
               <w:spacing w:after="100" w:before="100" w:line="240"/>
               <w:ind w:left="100" w:right="100" w:firstLine="0" w:firstLineChars="0"/>
               <w:rPr>
-                <w:rFonts w:ascii="Times New Roman" w:hAnsi="Times New Roman" w:eastAsia="Times New Roman" w:cs="Times New Roman"/>
-                <w:i w:val="false"/>
-                <w:b w:val="false"/>
-                <w:u w:val="none"/>
-                <w:strike w:val="false"/>
-                <w:sz w:val="22"/>
-                <w:szCs w:val="22"/>
-                <w:color w:val="000000"/>
-              </w:rPr>
-            </w:pPr>
-            <w:r>
-              <w:rPr>
-                <w:rFonts w:ascii="Times New Roman" w:hAnsi="Times New Roman" w:eastAsia="Times New Roman" w:cs="Times New Roman"/>
+                <w:rFonts w:ascii="Helvetica" w:hAnsi="Helvetica" w:eastAsia="Helvetica" w:cs="Helvetica"/>
+                <w:i w:val="false"/>
+                <w:b w:val="false"/>
+                <w:u w:val="none"/>
+                <w:strike w:val="false"/>
+                <w:sz w:val="22"/>
+                <w:szCs w:val="22"/>
+                <w:color w:val="000000"/>
+              </w:rPr>
+            </w:pPr>
+            <w:r>
+              <w:rPr>
+                <w:rFonts w:ascii="Helvetica" w:hAnsi="Helvetica" w:eastAsia="Helvetica" w:cs="Helvetica"/>
                 <w:i w:val="false"/>
                 <w:b w:val="false"/>
                 <w:u w:val="none"/>
@@ -1357,19 +1357,19 @@
               <w:spacing w:after="100" w:before="100" w:line="240"/>
               <w:ind w:left="100" w:right="100" w:firstLine="0" w:firstLineChars="0"/>
               <w:rPr>
-                <w:rFonts w:ascii="Times New Roman" w:hAnsi="Times New Roman" w:eastAsia="Times New Roman" w:cs="Times New Roman"/>
-                <w:i w:val="false"/>
-                <w:b w:val="false"/>
-                <w:u w:val="none"/>
-                <w:strike w:val="false"/>
-                <w:sz w:val="22"/>
-                <w:szCs w:val="22"/>
-                <w:color w:val="000000"/>
-              </w:rPr>
-            </w:pPr>
-            <w:r>
-              <w:rPr>
-                <w:rFonts w:ascii="Times New Roman" w:hAnsi="Times New Roman" w:eastAsia="Times New Roman" w:cs="Times New Roman"/>
+                <w:rFonts w:ascii="Helvetica" w:hAnsi="Helvetica" w:eastAsia="Helvetica" w:cs="Helvetica"/>
+                <w:i w:val="false"/>
+                <w:b w:val="false"/>
+                <w:u w:val="none"/>
+                <w:strike w:val="false"/>
+                <w:sz w:val="22"/>
+                <w:szCs w:val="22"/>
+                <w:color w:val="000000"/>
+              </w:rPr>
+            </w:pPr>
+            <w:r>
+              <w:rPr>
+                <w:rFonts w:ascii="Helvetica" w:hAnsi="Helvetica" w:eastAsia="Helvetica" w:cs="Helvetica"/>
                 <w:i w:val="false"/>
                 <w:b w:val="false"/>
                 <w:u w:val="none"/>
@@ -1417,19 +1417,19 @@
               <w:spacing w:after="100" w:before="100" w:line="240"/>
               <w:ind w:left="100" w:right="100" w:firstLine="0" w:firstLineChars="0"/>
               <w:rPr>
-                <w:rFonts w:ascii="Times New Roman" w:hAnsi="Times New Roman" w:eastAsia="Times New Roman" w:cs="Times New Roman"/>
-                <w:i w:val="false"/>
-                <w:b w:val="false"/>
-                <w:u w:val="none"/>
-                <w:strike w:val="false"/>
-                <w:sz w:val="22"/>
-                <w:szCs w:val="22"/>
-                <w:color w:val="000000"/>
-              </w:rPr>
-            </w:pPr>
-            <w:r>
-              <w:rPr>
-                <w:rFonts w:ascii="Times New Roman" w:hAnsi="Times New Roman" w:eastAsia="Times New Roman" w:cs="Times New Roman"/>
+                <w:rFonts w:ascii="Helvetica" w:hAnsi="Helvetica" w:eastAsia="Helvetica" w:cs="Helvetica"/>
+                <w:i w:val="false"/>
+                <w:b w:val="false"/>
+                <w:u w:val="none"/>
+                <w:strike w:val="false"/>
+                <w:sz w:val="22"/>
+                <w:szCs w:val="22"/>
+                <w:color w:val="000000"/>
+              </w:rPr>
+            </w:pPr>
+            <w:r>
+              <w:rPr>
+                <w:rFonts w:ascii="Helvetica" w:hAnsi="Helvetica" w:eastAsia="Helvetica" w:cs="Helvetica"/>
                 <w:i w:val="false"/>
                 <w:b w:val="false"/>
                 <w:u w:val="none"/>
@@ -1472,19 +1472,19 @@
               <w:spacing w:after="100" w:before="100" w:line="240"/>
               <w:ind w:left="100" w:right="100" w:firstLine="0" w:firstLineChars="0"/>
               <w:rPr>
-                <w:rFonts w:ascii="Times New Roman" w:hAnsi="Times New Roman" w:eastAsia="Times New Roman" w:cs="Times New Roman"/>
-                <w:i w:val="false"/>
-                <w:b w:val="false"/>
-                <w:u w:val="none"/>
-                <w:strike w:val="false"/>
-                <w:sz w:val="22"/>
-                <w:szCs w:val="22"/>
-                <w:color w:val="000000"/>
-              </w:rPr>
-            </w:pPr>
-            <w:r>
-              <w:rPr>
-                <w:rFonts w:ascii="Times New Roman" w:hAnsi="Times New Roman" w:eastAsia="Times New Roman" w:cs="Times New Roman"/>
+                <w:rFonts w:ascii="Helvetica" w:hAnsi="Helvetica" w:eastAsia="Helvetica" w:cs="Helvetica"/>
+                <w:i w:val="false"/>
+                <w:b w:val="false"/>
+                <w:u w:val="none"/>
+                <w:strike w:val="false"/>
+                <w:sz w:val="22"/>
+                <w:szCs w:val="22"/>
+                <w:color w:val="000000"/>
+              </w:rPr>
+            </w:pPr>
+            <w:r>
+              <w:rPr>
+                <w:rFonts w:ascii="Helvetica" w:hAnsi="Helvetica" w:eastAsia="Helvetica" w:cs="Helvetica"/>
                 <w:i w:val="false"/>
                 <w:b w:val="false"/>
                 <w:u w:val="none"/>
@@ -1527,19 +1527,19 @@
               <w:spacing w:after="100" w:before="100" w:line="240"/>
               <w:ind w:left="100" w:right="100" w:firstLine="0" w:firstLineChars="0"/>
               <w:rPr>
-                <w:rFonts w:ascii="Times New Roman" w:hAnsi="Times New Roman" w:eastAsia="Times New Roman" w:cs="Times New Roman"/>
-                <w:i w:val="false"/>
-                <w:b w:val="false"/>
-                <w:u w:val="none"/>
-                <w:strike w:val="false"/>
-                <w:sz w:val="22"/>
-                <w:szCs w:val="22"/>
-                <w:color w:val="000000"/>
-              </w:rPr>
-            </w:pPr>
-            <w:r>
-              <w:rPr>
-                <w:rFonts w:ascii="Times New Roman" w:hAnsi="Times New Roman" w:eastAsia="Times New Roman" w:cs="Times New Roman"/>
+                <w:rFonts w:ascii="Helvetica" w:hAnsi="Helvetica" w:eastAsia="Helvetica" w:cs="Helvetica"/>
+                <w:i w:val="false"/>
+                <w:b w:val="false"/>
+                <w:u w:val="none"/>
+                <w:strike w:val="false"/>
+                <w:sz w:val="22"/>
+                <w:szCs w:val="22"/>
+                <w:color w:val="000000"/>
+              </w:rPr>
+            </w:pPr>
+            <w:r>
+              <w:rPr>
+                <w:rFonts w:ascii="Helvetica" w:hAnsi="Helvetica" w:eastAsia="Helvetica" w:cs="Helvetica"/>
                 <w:i w:val="false"/>
                 <w:b w:val="false"/>
                 <w:u w:val="none"/>
@@ -1587,19 +1587,19 @@
               <w:spacing w:after="100" w:before="100" w:line="240"/>
               <w:ind w:left="100" w:right="100" w:firstLine="0" w:firstLineChars="0"/>
               <w:rPr>
-                <w:rFonts w:ascii="Times New Roman" w:hAnsi="Times New Roman" w:eastAsia="Times New Roman" w:cs="Times New Roman"/>
-                <w:i w:val="false"/>
-                <w:b w:val="false"/>
-                <w:u w:val="none"/>
-                <w:strike w:val="false"/>
-                <w:sz w:val="22"/>
-                <w:szCs w:val="22"/>
-                <w:color w:val="000000"/>
-              </w:rPr>
-            </w:pPr>
-            <w:r>
-              <w:rPr>
-                <w:rFonts w:ascii="Times New Roman" w:hAnsi="Times New Roman" w:eastAsia="Times New Roman" w:cs="Times New Roman"/>
+                <w:rFonts w:ascii="Helvetica" w:hAnsi="Helvetica" w:eastAsia="Helvetica" w:cs="Helvetica"/>
+                <w:i w:val="false"/>
+                <w:b w:val="false"/>
+                <w:u w:val="none"/>
+                <w:strike w:val="false"/>
+                <w:sz w:val="22"/>
+                <w:szCs w:val="22"/>
+                <w:color w:val="000000"/>
+              </w:rPr>
+            </w:pPr>
+            <w:r>
+              <w:rPr>
+                <w:rFonts w:ascii="Helvetica" w:hAnsi="Helvetica" w:eastAsia="Helvetica" w:cs="Helvetica"/>
                 <w:i w:val="false"/>
                 <w:b w:val="false"/>
                 <w:u w:val="none"/>
@@ -1642,19 +1642,19 @@
               <w:spacing w:after="100" w:before="100" w:line="240"/>
               <w:ind w:left="100" w:right="100" w:firstLine="0" w:firstLineChars="0"/>
               <w:rPr>
-                <w:rFonts w:ascii="Times New Roman" w:hAnsi="Times New Roman" w:eastAsia="Times New Roman" w:cs="Times New Roman"/>
-                <w:i w:val="false"/>
-                <w:b w:val="false"/>
-                <w:u w:val="none"/>
-                <w:strike w:val="false"/>
-                <w:sz w:val="22"/>
-                <w:szCs w:val="22"/>
-                <w:color w:val="000000"/>
-              </w:rPr>
-            </w:pPr>
-            <w:r>
-              <w:rPr>
-                <w:rFonts w:ascii="Times New Roman" w:hAnsi="Times New Roman" w:eastAsia="Times New Roman" w:cs="Times New Roman"/>
+                <w:rFonts w:ascii="Helvetica" w:hAnsi="Helvetica" w:eastAsia="Helvetica" w:cs="Helvetica"/>
+                <w:i w:val="false"/>
+                <w:b w:val="false"/>
+                <w:u w:val="none"/>
+                <w:strike w:val="false"/>
+                <w:sz w:val="22"/>
+                <w:szCs w:val="22"/>
+                <w:color w:val="000000"/>
+              </w:rPr>
+            </w:pPr>
+            <w:r>
+              <w:rPr>
+                <w:rFonts w:ascii="Helvetica" w:hAnsi="Helvetica" w:eastAsia="Helvetica" w:cs="Helvetica"/>
                 <w:i w:val="false"/>
                 <w:b w:val="false"/>
                 <w:u w:val="none"/>
@@ -1697,19 +1697,19 @@
               <w:spacing w:after="100" w:before="100" w:line="240"/>
               <w:ind w:left="100" w:right="100" w:firstLine="0" w:firstLineChars="0"/>
               <w:rPr>
-                <w:rFonts w:ascii="Times New Roman" w:hAnsi="Times New Roman" w:eastAsia="Times New Roman" w:cs="Times New Roman"/>
-                <w:i w:val="false"/>
-                <w:b w:val="false"/>
-                <w:u w:val="none"/>
-                <w:strike w:val="false"/>
-                <w:sz w:val="22"/>
-                <w:szCs w:val="22"/>
-                <w:color w:val="000000"/>
-              </w:rPr>
-            </w:pPr>
-            <w:r>
-              <w:rPr>
-                <w:rFonts w:ascii="Times New Roman" w:hAnsi="Times New Roman" w:eastAsia="Times New Roman" w:cs="Times New Roman"/>
+                <w:rFonts w:ascii="Helvetica" w:hAnsi="Helvetica" w:eastAsia="Helvetica" w:cs="Helvetica"/>
+                <w:i w:val="false"/>
+                <w:b w:val="false"/>
+                <w:u w:val="none"/>
+                <w:strike w:val="false"/>
+                <w:sz w:val="22"/>
+                <w:szCs w:val="22"/>
+                <w:color w:val="000000"/>
+              </w:rPr>
+            </w:pPr>
+            <w:r>
+              <w:rPr>
+                <w:rFonts w:ascii="Helvetica" w:hAnsi="Helvetica" w:eastAsia="Helvetica" w:cs="Helvetica"/>
                 <w:i w:val="false"/>
                 <w:b w:val="false"/>
                 <w:u w:val="none"/>
@@ -1757,19 +1757,19 @@
               <w:spacing w:after="100" w:before="100" w:line="240"/>
               <w:ind w:left="100" w:right="100" w:firstLine="0" w:firstLineChars="0"/>
               <w:rPr>
-                <w:rFonts w:ascii="Times New Roman" w:hAnsi="Times New Roman" w:eastAsia="Times New Roman" w:cs="Times New Roman"/>
-                <w:i w:val="false"/>
-                <w:b w:val="false"/>
-                <w:u w:val="none"/>
-                <w:strike w:val="false"/>
-                <w:sz w:val="22"/>
-                <w:szCs w:val="22"/>
-                <w:color w:val="000000"/>
-              </w:rPr>
-            </w:pPr>
-            <w:r>
-              <w:rPr>
-                <w:rFonts w:ascii="Times New Roman" w:hAnsi="Times New Roman" w:eastAsia="Times New Roman" w:cs="Times New Roman"/>
+                <w:rFonts w:ascii="Helvetica" w:hAnsi="Helvetica" w:eastAsia="Helvetica" w:cs="Helvetica"/>
+                <w:i w:val="false"/>
+                <w:b w:val="false"/>
+                <w:u w:val="none"/>
+                <w:strike w:val="false"/>
+                <w:sz w:val="22"/>
+                <w:szCs w:val="22"/>
+                <w:color w:val="000000"/>
+              </w:rPr>
+            </w:pPr>
+            <w:r>
+              <w:rPr>
+                <w:rFonts w:ascii="Helvetica" w:hAnsi="Helvetica" w:eastAsia="Helvetica" w:cs="Helvetica"/>
                 <w:i w:val="false"/>
                 <w:b w:val="false"/>
                 <w:u w:val="none"/>
@@ -1812,19 +1812,19 @@
               <w:spacing w:after="100" w:before="100" w:line="240"/>
               <w:ind w:left="100" w:right="100" w:firstLine="0" w:firstLineChars="0"/>
               <w:rPr>
-                <w:rFonts w:ascii="Times New Roman" w:hAnsi="Times New Roman" w:eastAsia="Times New Roman" w:cs="Times New Roman"/>
-                <w:i w:val="false"/>
-                <w:b w:val="false"/>
-                <w:u w:val="none"/>
-                <w:strike w:val="false"/>
-                <w:sz w:val="22"/>
-                <w:szCs w:val="22"/>
-                <w:color w:val="000000"/>
-              </w:rPr>
-            </w:pPr>
-            <w:r>
-              <w:rPr>
-                <w:rFonts w:ascii="Times New Roman" w:hAnsi="Times New Roman" w:eastAsia="Times New Roman" w:cs="Times New Roman"/>
+                <w:rFonts w:ascii="Helvetica" w:hAnsi="Helvetica" w:eastAsia="Helvetica" w:cs="Helvetica"/>
+                <w:i w:val="false"/>
+                <w:b w:val="false"/>
+                <w:u w:val="none"/>
+                <w:strike w:val="false"/>
+                <w:sz w:val="22"/>
+                <w:szCs w:val="22"/>
+                <w:color w:val="000000"/>
+              </w:rPr>
+            </w:pPr>
+            <w:r>
+              <w:rPr>
+                <w:rFonts w:ascii="Helvetica" w:hAnsi="Helvetica" w:eastAsia="Helvetica" w:cs="Helvetica"/>
                 <w:i w:val="false"/>
                 <w:b w:val="false"/>
                 <w:u w:val="none"/>
@@ -1867,19 +1867,19 @@
               <w:spacing w:after="100" w:before="100" w:line="240"/>
               <w:ind w:left="100" w:right="100" w:firstLine="0" w:firstLineChars="0"/>
               <w:rPr>
-                <w:rFonts w:ascii="Times New Roman" w:hAnsi="Times New Roman" w:eastAsia="Times New Roman" w:cs="Times New Roman"/>
-                <w:i w:val="false"/>
-                <w:b w:val="false"/>
-                <w:u w:val="none"/>
-                <w:strike w:val="false"/>
-                <w:sz w:val="22"/>
-                <w:szCs w:val="22"/>
-                <w:color w:val="000000"/>
-              </w:rPr>
-            </w:pPr>
-            <w:r>
-              <w:rPr>
-                <w:rFonts w:ascii="Times New Roman" w:hAnsi="Times New Roman" w:eastAsia="Times New Roman" w:cs="Times New Roman"/>
+                <w:rFonts w:ascii="Helvetica" w:hAnsi="Helvetica" w:eastAsia="Helvetica" w:cs="Helvetica"/>
+                <w:i w:val="false"/>
+                <w:b w:val="false"/>
+                <w:u w:val="none"/>
+                <w:strike w:val="false"/>
+                <w:sz w:val="22"/>
+                <w:szCs w:val="22"/>
+                <w:color w:val="000000"/>
+              </w:rPr>
+            </w:pPr>
+            <w:r>
+              <w:rPr>
+                <w:rFonts w:ascii="Helvetica" w:hAnsi="Helvetica" w:eastAsia="Helvetica" w:cs="Helvetica"/>
                 <w:i w:val="false"/>
                 <w:b w:val="false"/>
                 <w:u w:val="none"/>
@@ -1927,19 +1927,19 @@
               <w:spacing w:after="100" w:before="100" w:line="240"/>
               <w:ind w:left="100" w:right="100" w:firstLine="0" w:firstLineChars="0"/>
               <w:rPr>
-                <w:rFonts w:ascii="Times New Roman" w:hAnsi="Times New Roman" w:eastAsia="Times New Roman" w:cs="Times New Roman"/>
-                <w:i w:val="false"/>
-                <w:b w:val="false"/>
-                <w:u w:val="none"/>
-                <w:strike w:val="false"/>
-                <w:sz w:val="22"/>
-                <w:szCs w:val="22"/>
-                <w:color w:val="000000"/>
-              </w:rPr>
-            </w:pPr>
-            <w:r>
-              <w:rPr>
-                <w:rFonts w:ascii="Times New Roman" w:hAnsi="Times New Roman" w:eastAsia="Times New Roman" w:cs="Times New Roman"/>
+                <w:rFonts w:ascii="Helvetica" w:hAnsi="Helvetica" w:eastAsia="Helvetica" w:cs="Helvetica"/>
+                <w:i w:val="false"/>
+                <w:b w:val="false"/>
+                <w:u w:val="none"/>
+                <w:strike w:val="false"/>
+                <w:sz w:val="22"/>
+                <w:szCs w:val="22"/>
+                <w:color w:val="000000"/>
+              </w:rPr>
+            </w:pPr>
+            <w:r>
+              <w:rPr>
+                <w:rFonts w:ascii="Helvetica" w:hAnsi="Helvetica" w:eastAsia="Helvetica" w:cs="Helvetica"/>
                 <w:i w:val="false"/>
                 <w:b w:val="false"/>
                 <w:u w:val="none"/>
@@ -1982,19 +1982,19 @@
               <w:spacing w:after="100" w:before="100" w:line="240"/>
               <w:ind w:left="100" w:right="100" w:firstLine="0" w:firstLineChars="0"/>
               <w:rPr>
-                <w:rFonts w:ascii="Times New Roman" w:hAnsi="Times New Roman" w:eastAsia="Times New Roman" w:cs="Times New Roman"/>
-                <w:i w:val="false"/>
-                <w:b w:val="false"/>
-                <w:u w:val="none"/>
-                <w:strike w:val="false"/>
-                <w:sz w:val="22"/>
-                <w:szCs w:val="22"/>
-                <w:color w:val="000000"/>
-              </w:rPr>
-            </w:pPr>
-            <w:r>
-              <w:rPr>
-                <w:rFonts w:ascii="Times New Roman" w:hAnsi="Times New Roman" w:eastAsia="Times New Roman" w:cs="Times New Roman"/>
+                <w:rFonts w:ascii="Helvetica" w:hAnsi="Helvetica" w:eastAsia="Helvetica" w:cs="Helvetica"/>
+                <w:i w:val="false"/>
+                <w:b w:val="false"/>
+                <w:u w:val="none"/>
+                <w:strike w:val="false"/>
+                <w:sz w:val="22"/>
+                <w:szCs w:val="22"/>
+                <w:color w:val="000000"/>
+              </w:rPr>
+            </w:pPr>
+            <w:r>
+              <w:rPr>
+                <w:rFonts w:ascii="Helvetica" w:hAnsi="Helvetica" w:eastAsia="Helvetica" w:cs="Helvetica"/>
                 <w:i w:val="false"/>
                 <w:b w:val="false"/>
                 <w:u w:val="none"/>
@@ -2037,19 +2037,19 @@
               <w:spacing w:after="100" w:before="100" w:line="240"/>
               <w:ind w:left="100" w:right="100" w:firstLine="0" w:firstLineChars="0"/>
               <w:rPr>
-                <w:rFonts w:ascii="Times New Roman" w:hAnsi="Times New Roman" w:eastAsia="Times New Roman" w:cs="Times New Roman"/>
-                <w:i w:val="false"/>
-                <w:b w:val="false"/>
-                <w:u w:val="none"/>
-                <w:strike w:val="false"/>
-                <w:sz w:val="22"/>
-                <w:szCs w:val="22"/>
-                <w:color w:val="000000"/>
-              </w:rPr>
-            </w:pPr>
-            <w:r>
-              <w:rPr>
-                <w:rFonts w:ascii="Times New Roman" w:hAnsi="Times New Roman" w:eastAsia="Times New Roman" w:cs="Times New Roman"/>
+                <w:rFonts w:ascii="Helvetica" w:hAnsi="Helvetica" w:eastAsia="Helvetica" w:cs="Helvetica"/>
+                <w:i w:val="false"/>
+                <w:b w:val="false"/>
+                <w:u w:val="none"/>
+                <w:strike w:val="false"/>
+                <w:sz w:val="22"/>
+                <w:szCs w:val="22"/>
+                <w:color w:val="000000"/>
+              </w:rPr>
+            </w:pPr>
+            <w:r>
+              <w:rPr>
+                <w:rFonts w:ascii="Helvetica" w:hAnsi="Helvetica" w:eastAsia="Helvetica" w:cs="Helvetica"/>
                 <w:i w:val="false"/>
                 <w:b w:val="false"/>
                 <w:u w:val="none"/>
@@ -2097,19 +2097,19 @@
               <w:spacing w:after="100" w:before="100" w:line="240"/>
               <w:ind w:left="100" w:right="100" w:firstLine="0" w:firstLineChars="0"/>
               <w:rPr>
-                <w:rFonts w:ascii="Times New Roman" w:hAnsi="Times New Roman" w:eastAsia="Times New Roman" w:cs="Times New Roman"/>
-                <w:i w:val="false"/>
-                <w:b w:val="false"/>
-                <w:u w:val="none"/>
-                <w:strike w:val="false"/>
-                <w:sz w:val="22"/>
-                <w:szCs w:val="22"/>
-                <w:color w:val="000000"/>
-              </w:rPr>
-            </w:pPr>
-            <w:r>
-              <w:rPr>
-                <w:rFonts w:ascii="Times New Roman" w:hAnsi="Times New Roman" w:eastAsia="Times New Roman" w:cs="Times New Roman"/>
+                <w:rFonts w:ascii="Helvetica" w:hAnsi="Helvetica" w:eastAsia="Helvetica" w:cs="Helvetica"/>
+                <w:i w:val="false"/>
+                <w:b w:val="false"/>
+                <w:u w:val="none"/>
+                <w:strike w:val="false"/>
+                <w:sz w:val="22"/>
+                <w:szCs w:val="22"/>
+                <w:color w:val="000000"/>
+              </w:rPr>
+            </w:pPr>
+            <w:r>
+              <w:rPr>
+                <w:rFonts w:ascii="Helvetica" w:hAnsi="Helvetica" w:eastAsia="Helvetica" w:cs="Helvetica"/>
                 <w:i w:val="false"/>
                 <w:b w:val="false"/>
                 <w:u w:val="none"/>
@@ -2152,19 +2152,19 @@
               <w:spacing w:after="100" w:before="100" w:line="240"/>
               <w:ind w:left="100" w:right="100" w:firstLine="0" w:firstLineChars="0"/>
               <w:rPr>
-                <w:rFonts w:ascii="Times New Roman" w:hAnsi="Times New Roman" w:eastAsia="Times New Roman" w:cs="Times New Roman"/>
-                <w:i w:val="false"/>
-                <w:b w:val="false"/>
-                <w:u w:val="none"/>
-                <w:strike w:val="false"/>
-                <w:sz w:val="22"/>
-                <w:szCs w:val="22"/>
-                <w:color w:val="000000"/>
-              </w:rPr>
-            </w:pPr>
-            <w:r>
-              <w:rPr>
-                <w:rFonts w:ascii="Times New Roman" w:hAnsi="Times New Roman" w:eastAsia="Times New Roman" w:cs="Times New Roman"/>
+                <w:rFonts w:ascii="Helvetica" w:hAnsi="Helvetica" w:eastAsia="Helvetica" w:cs="Helvetica"/>
+                <w:i w:val="false"/>
+                <w:b w:val="false"/>
+                <w:u w:val="none"/>
+                <w:strike w:val="false"/>
+                <w:sz w:val="22"/>
+                <w:szCs w:val="22"/>
+                <w:color w:val="000000"/>
+              </w:rPr>
+            </w:pPr>
+            <w:r>
+              <w:rPr>
+                <w:rFonts w:ascii="Helvetica" w:hAnsi="Helvetica" w:eastAsia="Helvetica" w:cs="Helvetica"/>
                 <w:i w:val="false"/>
                 <w:b w:val="false"/>
                 <w:u w:val="none"/>
@@ -2207,19 +2207,19 @@
               <w:spacing w:after="100" w:before="100" w:line="240"/>
               <w:ind w:left="100" w:right="100" w:firstLine="0" w:firstLineChars="0"/>
               <w:rPr>
-                <w:rFonts w:ascii="Times New Roman" w:hAnsi="Times New Roman" w:eastAsia="Times New Roman" w:cs="Times New Roman"/>
-                <w:i w:val="false"/>
-                <w:b w:val="false"/>
-                <w:u w:val="none"/>
-                <w:strike w:val="false"/>
-                <w:sz w:val="22"/>
-                <w:szCs w:val="22"/>
-                <w:color w:val="000000"/>
-              </w:rPr>
-            </w:pPr>
-            <w:r>
-              <w:rPr>
-                <w:rFonts w:ascii="Times New Roman" w:hAnsi="Times New Roman" w:eastAsia="Times New Roman" w:cs="Times New Roman"/>
+                <w:rFonts w:ascii="Helvetica" w:hAnsi="Helvetica" w:eastAsia="Helvetica" w:cs="Helvetica"/>
+                <w:i w:val="false"/>
+                <w:b w:val="false"/>
+                <w:u w:val="none"/>
+                <w:strike w:val="false"/>
+                <w:sz w:val="22"/>
+                <w:szCs w:val="22"/>
+                <w:color w:val="000000"/>
+              </w:rPr>
+            </w:pPr>
+            <w:r>
+              <w:rPr>
+                <w:rFonts w:ascii="Helvetica" w:hAnsi="Helvetica" w:eastAsia="Helvetica" w:cs="Helvetica"/>
                 <w:i w:val="false"/>
                 <w:b w:val="false"/>
                 <w:u w:val="none"/>
@@ -2267,7 +2267,7 @@
               <w:spacing w:after="100" w:before="100" w:line="240"/>
               <w:ind w:left="100" w:right="100" w:firstLine="0" w:firstLineChars="0"/>
               <w:rPr>
-                <w:rFonts w:ascii="Times New Roman" w:hAnsi="Times New Roman" w:eastAsia="Times New Roman" w:cs="Times New Roman"/>
+                <w:rFonts w:ascii="Helvetica" w:hAnsi="Helvetica" w:eastAsia="Helvetica" w:cs="Helvetica"/>
                 <w:i w:val="false"/>
                 <w:b w:val="true"/>
                 <w:u w:val="none"/>
@@ -2279,7 +2279,7 @@
             </w:pPr>
             <w:r>
               <w:rPr>
-                <w:rFonts w:ascii="Times New Roman" w:hAnsi="Times New Roman" w:eastAsia="Times New Roman" w:cs="Times New Roman"/>
+                <w:rFonts w:ascii="Helvetica" w:hAnsi="Helvetica" w:eastAsia="Helvetica" w:cs="Helvetica"/>
                 <w:i w:val="false"/>
                 <w:b w:val="true"/>
                 <w:u w:val="none"/>
@@ -2322,7 +2322,7 @@
               <w:spacing w:after="100" w:before="100" w:line="240"/>
               <w:ind w:left="100" w:right="100" w:firstLine="0" w:firstLineChars="0"/>
               <w:rPr>
-                <w:rFonts w:ascii="Times New Roman" w:hAnsi="Times New Roman" w:eastAsia="Times New Roman" w:cs="Times New Roman"/>
+                <w:rFonts w:ascii="Helvetica" w:hAnsi="Helvetica" w:eastAsia="Helvetica" w:cs="Helvetica"/>
                 <w:i w:val="false"/>
                 <w:b w:val="true"/>
                 <w:u w:val="none"/>
@@ -2334,7 +2334,7 @@
             </w:pPr>
             <w:r>
               <w:rPr>
-                <w:rFonts w:ascii="Times New Roman" w:hAnsi="Times New Roman" w:eastAsia="Times New Roman" w:cs="Times New Roman"/>
+                <w:rFonts w:ascii="Helvetica" w:hAnsi="Helvetica" w:eastAsia="Helvetica" w:cs="Helvetica"/>
                 <w:i w:val="false"/>
                 <w:b w:val="true"/>
                 <w:u w:val="none"/>
@@ -2377,7 +2377,7 @@
               <w:spacing w:after="100" w:before="100" w:line="240"/>
               <w:ind w:left="100" w:right="100" w:firstLine="0" w:firstLineChars="0"/>
               <w:rPr>
-                <w:rFonts w:ascii="Times New Roman" w:hAnsi="Times New Roman" w:eastAsia="Times New Roman" w:cs="Times New Roman"/>
+                <w:rFonts w:ascii="Helvetica" w:hAnsi="Helvetica" w:eastAsia="Helvetica" w:cs="Helvetica"/>
                 <w:i w:val="false"/>
                 <w:b w:val="true"/>
                 <w:u w:val="none"/>
@@ -2389,7 +2389,7 @@
             </w:pPr>
             <w:r>
               <w:rPr>
-                <w:rFonts w:ascii="Times New Roman" w:hAnsi="Times New Roman" w:eastAsia="Times New Roman" w:cs="Times New Roman"/>
+                <w:rFonts w:ascii="Helvetica" w:hAnsi="Helvetica" w:eastAsia="Helvetica" w:cs="Helvetica"/>
                 <w:i w:val="false"/>
                 <w:b w:val="true"/>
                 <w:u w:val="none"/>
@@ -2437,19 +2437,19 @@
               <w:spacing w:after="100" w:before="100" w:line="240"/>
               <w:ind w:left="100" w:right="100" w:firstLine="0" w:firstLineChars="0"/>
               <w:rPr>
-                <w:rFonts w:ascii="Times New Roman" w:hAnsi="Times New Roman" w:eastAsia="Times New Roman" w:cs="Times New Roman"/>
-                <w:i w:val="false"/>
-                <w:b w:val="false"/>
-                <w:u w:val="none"/>
-                <w:strike w:val="false"/>
-                <w:sz w:val="22"/>
-                <w:szCs w:val="22"/>
-                <w:color w:val="000000"/>
-              </w:rPr>
-            </w:pPr>
-            <w:r>
-              <w:rPr>
-                <w:rFonts w:ascii="Times New Roman" w:hAnsi="Times New Roman" w:eastAsia="Times New Roman" w:cs="Times New Roman"/>
+                <w:rFonts w:ascii="Helvetica" w:hAnsi="Helvetica" w:eastAsia="Helvetica" w:cs="Helvetica"/>
+                <w:i w:val="false"/>
+                <w:b w:val="false"/>
+                <w:u w:val="none"/>
+                <w:strike w:val="false"/>
+                <w:sz w:val="22"/>
+                <w:szCs w:val="22"/>
+                <w:color w:val="000000"/>
+              </w:rPr>
+            </w:pPr>
+            <w:r>
+              <w:rPr>
+                <w:rFonts w:ascii="Helvetica" w:hAnsi="Helvetica" w:eastAsia="Helvetica" w:cs="Helvetica"/>
                 <w:i w:val="false"/>
                 <w:b w:val="false"/>
                 <w:u w:val="none"/>
@@ -2492,19 +2492,19 @@
               <w:spacing w:after="100" w:before="100" w:line="240"/>
               <w:ind w:left="100" w:right="100" w:firstLine="0" w:firstLineChars="0"/>
               <w:rPr>
-                <w:rFonts w:ascii="Times New Roman" w:hAnsi="Times New Roman" w:eastAsia="Times New Roman" w:cs="Times New Roman"/>
-                <w:i w:val="false"/>
-                <w:b w:val="false"/>
-                <w:u w:val="none"/>
-                <w:strike w:val="false"/>
-                <w:sz w:val="22"/>
-                <w:szCs w:val="22"/>
-                <w:color w:val="000000"/>
-              </w:rPr>
-            </w:pPr>
-            <w:r>
-              <w:rPr>
-                <w:rFonts w:ascii="Times New Roman" w:hAnsi="Times New Roman" w:eastAsia="Times New Roman" w:cs="Times New Roman"/>
+                <w:rFonts w:ascii="Helvetica" w:hAnsi="Helvetica" w:eastAsia="Helvetica" w:cs="Helvetica"/>
+                <w:i w:val="false"/>
+                <w:b w:val="false"/>
+                <w:u w:val="none"/>
+                <w:strike w:val="false"/>
+                <w:sz w:val="22"/>
+                <w:szCs w:val="22"/>
+                <w:color w:val="000000"/>
+              </w:rPr>
+            </w:pPr>
+            <w:r>
+              <w:rPr>
+                <w:rFonts w:ascii="Helvetica" w:hAnsi="Helvetica" w:eastAsia="Helvetica" w:cs="Helvetica"/>
                 <w:i w:val="false"/>
                 <w:b w:val="false"/>
                 <w:u w:val="none"/>
@@ -2547,19 +2547,19 @@
               <w:spacing w:after="100" w:before="100" w:line="240"/>
               <w:ind w:left="100" w:right="100" w:firstLine="0" w:firstLineChars="0"/>
               <w:rPr>
-                <w:rFonts w:ascii="Times New Roman" w:hAnsi="Times New Roman" w:eastAsia="Times New Roman" w:cs="Times New Roman"/>
-                <w:i w:val="false"/>
-                <w:b w:val="false"/>
-                <w:u w:val="none"/>
-                <w:strike w:val="false"/>
-                <w:sz w:val="22"/>
-                <w:szCs w:val="22"/>
-                <w:color w:val="000000"/>
-              </w:rPr>
-            </w:pPr>
-            <w:r>
-              <w:rPr>
-                <w:rFonts w:ascii="Times New Roman" w:hAnsi="Times New Roman" w:eastAsia="Times New Roman" w:cs="Times New Roman"/>
+                <w:rFonts w:ascii="Helvetica" w:hAnsi="Helvetica" w:eastAsia="Helvetica" w:cs="Helvetica"/>
+                <w:i w:val="false"/>
+                <w:b w:val="false"/>
+                <w:u w:val="none"/>
+                <w:strike w:val="false"/>
+                <w:sz w:val="22"/>
+                <w:szCs w:val="22"/>
+                <w:color w:val="000000"/>
+              </w:rPr>
+            </w:pPr>
+            <w:r>
+              <w:rPr>
+                <w:rFonts w:ascii="Helvetica" w:hAnsi="Helvetica" w:eastAsia="Helvetica" w:cs="Helvetica"/>
                 <w:i w:val="false"/>
                 <w:b w:val="false"/>
                 <w:u w:val="none"/>
@@ -2607,19 +2607,19 @@
               <w:spacing w:after="100" w:before="100" w:line="240"/>
               <w:ind w:left="100" w:right="100" w:firstLine="0" w:firstLineChars="0"/>
               <w:rPr>
-                <w:rFonts w:ascii="Times New Roman" w:hAnsi="Times New Roman" w:eastAsia="Times New Roman" w:cs="Times New Roman"/>
-                <w:i w:val="false"/>
-                <w:b w:val="false"/>
-                <w:u w:val="none"/>
-                <w:strike w:val="false"/>
-                <w:sz w:val="22"/>
-                <w:szCs w:val="22"/>
-                <w:color w:val="000000"/>
-              </w:rPr>
-            </w:pPr>
-            <w:r>
-              <w:rPr>
-                <w:rFonts w:ascii="Times New Roman" w:hAnsi="Times New Roman" w:eastAsia="Times New Roman" w:cs="Times New Roman"/>
+                <w:rFonts w:ascii="Helvetica" w:hAnsi="Helvetica" w:eastAsia="Helvetica" w:cs="Helvetica"/>
+                <w:i w:val="false"/>
+                <w:b w:val="false"/>
+                <w:u w:val="none"/>
+                <w:strike w:val="false"/>
+                <w:sz w:val="22"/>
+                <w:szCs w:val="22"/>
+                <w:color w:val="000000"/>
+              </w:rPr>
+            </w:pPr>
+            <w:r>
+              <w:rPr>
+                <w:rFonts w:ascii="Helvetica" w:hAnsi="Helvetica" w:eastAsia="Helvetica" w:cs="Helvetica"/>
                 <w:i w:val="false"/>
                 <w:b w:val="false"/>
                 <w:u w:val="none"/>
@@ -2662,19 +2662,19 @@
               <w:spacing w:after="100" w:before="100" w:line="240"/>
               <w:ind w:left="100" w:right="100" w:firstLine="0" w:firstLineChars="0"/>
               <w:rPr>
-                <w:rFonts w:ascii="Times New Roman" w:hAnsi="Times New Roman" w:eastAsia="Times New Roman" w:cs="Times New Roman"/>
-                <w:i w:val="false"/>
-                <w:b w:val="false"/>
-                <w:u w:val="none"/>
-                <w:strike w:val="false"/>
-                <w:sz w:val="22"/>
-                <w:szCs w:val="22"/>
-                <w:color w:val="000000"/>
-              </w:rPr>
-            </w:pPr>
-            <w:r>
-              <w:rPr>
-                <w:rFonts w:ascii="Times New Roman" w:hAnsi="Times New Roman" w:eastAsia="Times New Roman" w:cs="Times New Roman"/>
+                <w:rFonts w:ascii="Helvetica" w:hAnsi="Helvetica" w:eastAsia="Helvetica" w:cs="Helvetica"/>
+                <w:i w:val="false"/>
+                <w:b w:val="false"/>
+                <w:u w:val="none"/>
+                <w:strike w:val="false"/>
+                <w:sz w:val="22"/>
+                <w:szCs w:val="22"/>
+                <w:color w:val="000000"/>
+              </w:rPr>
+            </w:pPr>
+            <w:r>
+              <w:rPr>
+                <w:rFonts w:ascii="Helvetica" w:hAnsi="Helvetica" w:eastAsia="Helvetica" w:cs="Helvetica"/>
                 <w:i w:val="false"/>
                 <w:b w:val="false"/>
                 <w:u w:val="none"/>
@@ -2717,19 +2717,19 @@
               <w:spacing w:after="100" w:before="100" w:line="240"/>
               <w:ind w:left="100" w:right="100" w:firstLine="0" w:firstLineChars="0"/>
               <w:rPr>
-                <w:rFonts w:ascii="Times New Roman" w:hAnsi="Times New Roman" w:eastAsia="Times New Roman" w:cs="Times New Roman"/>
-                <w:i w:val="false"/>
-                <w:b w:val="false"/>
-                <w:u w:val="none"/>
-                <w:strike w:val="false"/>
-                <w:sz w:val="22"/>
-                <w:szCs w:val="22"/>
-                <w:color w:val="000000"/>
-              </w:rPr>
-            </w:pPr>
-            <w:r>
-              <w:rPr>
-                <w:rFonts w:ascii="Times New Roman" w:hAnsi="Times New Roman" w:eastAsia="Times New Roman" w:cs="Times New Roman"/>
+                <w:rFonts w:ascii="Helvetica" w:hAnsi="Helvetica" w:eastAsia="Helvetica" w:cs="Helvetica"/>
+                <w:i w:val="false"/>
+                <w:b w:val="false"/>
+                <w:u w:val="none"/>
+                <w:strike w:val="false"/>
+                <w:sz w:val="22"/>
+                <w:szCs w:val="22"/>
+                <w:color w:val="000000"/>
+              </w:rPr>
+            </w:pPr>
+            <w:r>
+              <w:rPr>
+                <w:rFonts w:ascii="Helvetica" w:hAnsi="Helvetica" w:eastAsia="Helvetica" w:cs="Helvetica"/>
                 <w:i w:val="false"/>
                 <w:b w:val="false"/>
                 <w:u w:val="none"/>
@@ -2777,28 +2777,28 @@
               <w:spacing w:after="100" w:before="100" w:line="240"/>
               <w:ind w:left="100" w:right="100" w:firstLine="0" w:firstLineChars="0"/>
               <w:rPr>
-                <w:rFonts w:ascii="Times New Roman" w:hAnsi="Times New Roman" w:eastAsia="Times New Roman" w:cs="Times New Roman"/>
-                <w:i w:val="false"/>
-                <w:b w:val="false"/>
-                <w:u w:val="none"/>
-                <w:strike w:val="false"/>
-                <w:sz w:val="22"/>
-                <w:szCs w:val="22"/>
-                <w:color w:val="000000"/>
-              </w:rPr>
-            </w:pPr>
-            <w:r>
-              <w:rPr>
-                <w:rFonts w:ascii="Times New Roman" w:hAnsi="Times New Roman" w:eastAsia="Times New Roman" w:cs="Times New Roman"/>
-                <w:i w:val="false"/>
-                <w:b w:val="false"/>
-                <w:u w:val="none"/>
-                <w:strike w:val="false"/>
-                <w:sz w:val="22"/>
-                <w:szCs w:val="22"/>
-                <w:color w:val="000000"/>
-              </w:rPr>
-              <w:t xml:space="preserve">  Subjective-Classroom ODR rate</w:t>
+                <w:rFonts w:ascii="Helvetica" w:hAnsi="Helvetica" w:eastAsia="Helvetica" w:cs="Helvetica"/>
+                <w:i w:val="false"/>
+                <w:b w:val="false"/>
+                <w:u w:val="none"/>
+                <w:strike w:val="false"/>
+                <w:sz w:val="22"/>
+                <w:szCs w:val="22"/>
+                <w:color w:val="000000"/>
+              </w:rPr>
+            </w:pPr>
+            <w:r>
+              <w:rPr>
+                <w:rFonts w:ascii="Helvetica" w:hAnsi="Helvetica" w:eastAsia="Helvetica" w:cs="Helvetica"/>
+                <w:i w:val="false"/>
+                <w:b w:val="false"/>
+                <w:u w:val="none"/>
+                <w:strike w:val="false"/>
+                <w:sz w:val="22"/>
+                <w:szCs w:val="22"/>
+                <w:color w:val="000000"/>
+              </w:rPr>
+              <w:t xml:space="preserve">  Subjective-classroom ODR rate</w:t>
             </w:r>
           </w:p>
         </w:tc>
@@ -2832,19 +2832,19 @@
               <w:spacing w:after="100" w:before="100" w:line="240"/>
               <w:ind w:left="100" w:right="100" w:firstLine="0" w:firstLineChars="0"/>
               <w:rPr>
-                <w:rFonts w:ascii="Times New Roman" w:hAnsi="Times New Roman" w:eastAsia="Times New Roman" w:cs="Times New Roman"/>
-                <w:i w:val="false"/>
-                <w:b w:val="false"/>
-                <w:u w:val="none"/>
-                <w:strike w:val="false"/>
-                <w:sz w:val="22"/>
-                <w:szCs w:val="22"/>
-                <w:color w:val="000000"/>
-              </w:rPr>
-            </w:pPr>
-            <w:r>
-              <w:rPr>
-                <w:rFonts w:ascii="Times New Roman" w:hAnsi="Times New Roman" w:eastAsia="Times New Roman" w:cs="Times New Roman"/>
+                <w:rFonts w:ascii="Helvetica" w:hAnsi="Helvetica" w:eastAsia="Helvetica" w:cs="Helvetica"/>
+                <w:i w:val="false"/>
+                <w:b w:val="false"/>
+                <w:u w:val="none"/>
+                <w:strike w:val="false"/>
+                <w:sz w:val="22"/>
+                <w:szCs w:val="22"/>
+                <w:color w:val="000000"/>
+              </w:rPr>
+            </w:pPr>
+            <w:r>
+              <w:rPr>
+                <w:rFonts w:ascii="Helvetica" w:hAnsi="Helvetica" w:eastAsia="Helvetica" w:cs="Helvetica"/>
                 <w:i w:val="false"/>
                 <w:b w:val="false"/>
                 <w:u w:val="none"/>
@@ -2887,19 +2887,19 @@
               <w:spacing w:after="100" w:before="100" w:line="240"/>
               <w:ind w:left="100" w:right="100" w:firstLine="0" w:firstLineChars="0"/>
               <w:rPr>
-                <w:rFonts w:ascii="Times New Roman" w:hAnsi="Times New Roman" w:eastAsia="Times New Roman" w:cs="Times New Roman"/>
-                <w:i w:val="false"/>
-                <w:b w:val="false"/>
-                <w:u w:val="none"/>
-                <w:strike w:val="false"/>
-                <w:sz w:val="22"/>
-                <w:szCs w:val="22"/>
-                <w:color w:val="000000"/>
-              </w:rPr>
-            </w:pPr>
-            <w:r>
-              <w:rPr>
-                <w:rFonts w:ascii="Times New Roman" w:hAnsi="Times New Roman" w:eastAsia="Times New Roman" w:cs="Times New Roman"/>
+                <w:rFonts w:ascii="Helvetica" w:hAnsi="Helvetica" w:eastAsia="Helvetica" w:cs="Helvetica"/>
+                <w:i w:val="false"/>
+                <w:b w:val="false"/>
+                <w:u w:val="none"/>
+                <w:strike w:val="false"/>
+                <w:sz w:val="22"/>
+                <w:szCs w:val="22"/>
+                <w:color w:val="000000"/>
+              </w:rPr>
+            </w:pPr>
+            <w:r>
+              <w:rPr>
+                <w:rFonts w:ascii="Helvetica" w:hAnsi="Helvetica" w:eastAsia="Helvetica" w:cs="Helvetica"/>
                 <w:i w:val="false"/>
                 <w:b w:val="false"/>
                 <w:u w:val="none"/>
@@ -2947,28 +2947,28 @@
               <w:spacing w:after="100" w:before="100" w:line="240"/>
               <w:ind w:left="100" w:right="100" w:firstLine="0" w:firstLineChars="0"/>
               <w:rPr>
-                <w:rFonts w:ascii="Times New Roman" w:hAnsi="Times New Roman" w:eastAsia="Times New Roman" w:cs="Times New Roman"/>
-                <w:i w:val="false"/>
-                <w:b w:val="false"/>
-                <w:u w:val="none"/>
-                <w:strike w:val="false"/>
-                <w:sz w:val="22"/>
-                <w:szCs w:val="22"/>
-                <w:color w:val="000000"/>
-              </w:rPr>
-            </w:pPr>
-            <w:r>
-              <w:rPr>
-                <w:rFonts w:ascii="Times New Roman" w:hAnsi="Times New Roman" w:eastAsia="Times New Roman" w:cs="Times New Roman"/>
-                <w:i w:val="false"/>
-                <w:b w:val="false"/>
-                <w:u w:val="none"/>
-                <w:strike w:val="false"/>
-                <w:sz w:val="22"/>
-                <w:szCs w:val="22"/>
-                <w:color w:val="000000"/>
-              </w:rPr>
-              <w:t xml:space="preserve">  Objective-Classroom ODR rate</w:t>
+                <w:rFonts w:ascii="Helvetica" w:hAnsi="Helvetica" w:eastAsia="Helvetica" w:cs="Helvetica"/>
+                <w:i w:val="false"/>
+                <w:b w:val="false"/>
+                <w:u w:val="none"/>
+                <w:strike w:val="false"/>
+                <w:sz w:val="22"/>
+                <w:szCs w:val="22"/>
+                <w:color w:val="000000"/>
+              </w:rPr>
+            </w:pPr>
+            <w:r>
+              <w:rPr>
+                <w:rFonts w:ascii="Helvetica" w:hAnsi="Helvetica" w:eastAsia="Helvetica" w:cs="Helvetica"/>
+                <w:i w:val="false"/>
+                <w:b w:val="false"/>
+                <w:u w:val="none"/>
+                <w:strike w:val="false"/>
+                <w:sz w:val="22"/>
+                <w:szCs w:val="22"/>
+                <w:color w:val="000000"/>
+              </w:rPr>
+              <w:t xml:space="preserve">  Objective-classroom ODR rate</w:t>
             </w:r>
           </w:p>
         </w:tc>
@@ -3002,19 +3002,19 @@
               <w:spacing w:after="100" w:before="100" w:line="240"/>
               <w:ind w:left="100" w:right="100" w:firstLine="0" w:firstLineChars="0"/>
               <w:rPr>
-                <w:rFonts w:ascii="Times New Roman" w:hAnsi="Times New Roman" w:eastAsia="Times New Roman" w:cs="Times New Roman"/>
-                <w:i w:val="false"/>
-                <w:b w:val="false"/>
-                <w:u w:val="none"/>
-                <w:strike w:val="false"/>
-                <w:sz w:val="22"/>
-                <w:szCs w:val="22"/>
-                <w:color w:val="000000"/>
-              </w:rPr>
-            </w:pPr>
-            <w:r>
-              <w:rPr>
-                <w:rFonts w:ascii="Times New Roman" w:hAnsi="Times New Roman" w:eastAsia="Times New Roman" w:cs="Times New Roman"/>
+                <w:rFonts w:ascii="Helvetica" w:hAnsi="Helvetica" w:eastAsia="Helvetica" w:cs="Helvetica"/>
+                <w:i w:val="false"/>
+                <w:b w:val="false"/>
+                <w:u w:val="none"/>
+                <w:strike w:val="false"/>
+                <w:sz w:val="22"/>
+                <w:szCs w:val="22"/>
+                <w:color w:val="000000"/>
+              </w:rPr>
+            </w:pPr>
+            <w:r>
+              <w:rPr>
+                <w:rFonts w:ascii="Helvetica" w:hAnsi="Helvetica" w:eastAsia="Helvetica" w:cs="Helvetica"/>
                 <w:i w:val="false"/>
                 <w:b w:val="false"/>
                 <w:u w:val="none"/>
@@ -3057,19 +3057,19 @@
               <w:spacing w:after="100" w:before="100" w:line="240"/>
               <w:ind w:left="100" w:right="100" w:firstLine="0" w:firstLineChars="0"/>
               <w:rPr>
-                <w:rFonts w:ascii="Times New Roman" w:hAnsi="Times New Roman" w:eastAsia="Times New Roman" w:cs="Times New Roman"/>
-                <w:i w:val="false"/>
-                <w:b w:val="false"/>
-                <w:u w:val="none"/>
-                <w:strike w:val="false"/>
-                <w:sz w:val="22"/>
-                <w:szCs w:val="22"/>
-                <w:color w:val="000000"/>
-              </w:rPr>
-            </w:pPr>
-            <w:r>
-              <w:rPr>
-                <w:rFonts w:ascii="Times New Roman" w:hAnsi="Times New Roman" w:eastAsia="Times New Roman" w:cs="Times New Roman"/>
+                <w:rFonts w:ascii="Helvetica" w:hAnsi="Helvetica" w:eastAsia="Helvetica" w:cs="Helvetica"/>
+                <w:i w:val="false"/>
+                <w:b w:val="false"/>
+                <w:u w:val="none"/>
+                <w:strike w:val="false"/>
+                <w:sz w:val="22"/>
+                <w:szCs w:val="22"/>
+                <w:color w:val="000000"/>
+              </w:rPr>
+            </w:pPr>
+            <w:r>
+              <w:rPr>
+                <w:rFonts w:ascii="Helvetica" w:hAnsi="Helvetica" w:eastAsia="Helvetica" w:cs="Helvetica"/>
                 <w:i w:val="false"/>
                 <w:b w:val="false"/>
                 <w:u w:val="none"/>

</xml_diff>